<commit_message>
feat(SIGAA): avanzar Sprint 1 con diseño y prototipo
</commit_message>
<xml_diff>
--- a/SIGAA/entregables/fase-1/1.5_Definicion_Proyecto_APT_SIGAA.docx
+++ b/SIGAA/entregables/fase-1/1.5_Definicion_Proyecto_APT_SIGAA.docx
@@ -1967,27 +1967,15 @@
             <w:vAlign w:val="center"/>
           </w:tcPr>
           <w:p>
-            <w:pPr>
-              <w:jc w:val="both"/>
-              <w:rPr>
-                <w:rFonts w:ascii="Calibri" w:hAnsi="Calibri" w:cs="Arial"/>
+            <w:r>
+              <w:rPr>
+                <w:rFonts w:ascii="Arial" w:hAnsi="Arial"/>
+                <w:b w:val="0"/>
                 <w:i/>
-                <w:color w:val="548DD4"/>
-                <w:sz w:val="20"/>
-                <w:szCs w:val="20"/>
-                <w:lang w:eastAsia="es-CL"/>
-              </w:rPr>
-            </w:pPr>
-            <w:r>
-              <w:rPr>
-                <w:rFonts w:ascii="Calibri" w:hAnsi="Calibri" w:cs="Arial"/>
-                <w:i/>
-                <w:color w:val="548DD4"/>
-                <w:sz w:val="20"/>
-                <w:szCs w:val="20"/>
-                <w:lang w:eastAsia="es-CL"/>
-              </w:rPr>
-              <w:t>Se aplicará Scrum en sprints de dos semanas, con Product Vision, Product Backlog priorizado, Sprint Backlog, Scrumboard, Definition of Done, impedimentos, pruebas y retrospectivas. Joel López asumirá Product Owner y arquitectura; Agustín Sorolla facilitará Scrum y frontend/UX; Matías Martínez liderará datos y calidad; los tres actuarán como Developers. Cada sprint incluirá Planning, seguimiento breve, refinamiento, Review y Retrospective. Las historias se cerrarán con criterios de aceptación, revisión de código, pruebas y evidencia en GitHub. Los roles propuestos deben ser validados por el equipo y la Carta Gantt se utilizará como vista académica de hitos.</w:t>
+                <w:color w:val="4472C4"/>
+                <w:sz w:val="21"/>
+              </w:rPr>
+              <w:t>Se aplicará Scrum en sprints de dos semanas, con Product Vision, Product Backlog priorizado, Sprint Backlog, Scrumboard, Definition of Done, registro Daily, burndown, Review y Retrospective. Joel López actúa como Product Owner. Los roles de Scrum Master, frontend/UX y datos/calidad se mantienen propuestos hasta su ratificación por el equipo. El MVP utilizará React, Node.js con Express, PostgreSQL, Docker Compose, pruebas automatizadas y documentación versionada en GitHub. Sprint 1 se concentra en arquitectura, modelo ER, UML y prototipo navegable con datos sintéticos. Una historia solo se cerrará con criterios de aceptación, pruebas y evidencia; las validaciones externas e individuales no serán simuladas como hechos reales.</w:t>
             </w:r>
           </w:p>
         </w:tc>
@@ -9438,6 +9426,2326 @@
       </w:tr>
     </w:tbl>
     <w:p/>
+    <w:p>
+      <w:r>
+        <w:br w:type="page"/>
+      </w:r>
+    </w:p>
+    <w:p>
+      <w:pPr>
+        <w:spacing w:before="960" w:after="120"/>
+        <w:ind w:left="0" w:firstLine="0"/>
+        <w:jc w:val="left"/>
+      </w:pPr>
+      <w:r>
+        <w:rPr>
+          <w:rFonts w:ascii="Arial" w:hAnsi="Arial"/>
+          <w:b/>
+          <w:i w:val="0"/>
+          <w:color w:val="243F6B"/>
+          <w:sz w:val="34"/>
+        </w:rPr>
+        <w:t>ANEXO A.</w:t>
+        <w:br/>
+        <w:t>RESUMEN EJECUTIVO Y ABSTRACT</w:t>
+      </w:r>
+    </w:p>
+    <w:p>
+      <w:pPr>
+        <w:spacing w:before="160" w:after="120"/>
+      </w:pPr>
+      <w:r>
+        <w:rPr>
+          <w:rFonts w:ascii="Arial" w:hAnsi="Arial"/>
+          <w:b/>
+          <w:i w:val="0"/>
+          <w:color w:val="4472C4"/>
+          <w:sz w:val="25"/>
+        </w:rPr>
+        <w:t>Resumen ejecutivo</w:t>
+      </w:r>
+    </w:p>
+    <w:p>
+      <w:pPr>
+        <w:spacing w:after="120" w:line="259" w:lineRule="auto"/>
+      </w:pPr>
+      <w:r>
+        <w:rPr>
+          <w:rFonts w:ascii="Arial" w:hAnsi="Arial"/>
+          <w:b w:val="0"/>
+          <w:i w:val="0"/>
+          <w:color w:val="19263C"/>
+          <w:sz w:val="21"/>
+        </w:rPr>
+        <w:t>SIGAA es un sistema web propuesto para centralizar información académica y transformar datos de asistencia y calificaciones en alertas tempranas explicables. El MVP permitirá gestionar el contexto académico, consultar fichas de estudiantes, priorizar alertas y registrar intervenciones con trazabilidad. El proyecto se desarrolla con Scrum durante 18 semanas y utiliza React, Node.js, PostgreSQL y Docker. Durante Sprint 1 se consolidaron la arquitectura, el modelo lógico, los casos de uso y un prototipo navegable con datos sintéticos. La solución aún requiere validación con una contraparte educativa antes de fijar reglas productivas.</w:t>
+      </w:r>
+    </w:p>
+    <w:p>
+      <w:pPr>
+        <w:spacing w:before="160" w:after="120"/>
+      </w:pPr>
+      <w:r>
+        <w:rPr>
+          <w:rFonts w:ascii="Arial" w:hAnsi="Arial"/>
+          <w:b/>
+          <w:i w:val="0"/>
+          <w:color w:val="4472C4"/>
+          <w:sz w:val="25"/>
+        </w:rPr>
+        <w:t>Abstract</w:t>
+      </w:r>
+    </w:p>
+    <w:p>
+      <w:pPr>
+        <w:spacing w:after="120" w:line="259" w:lineRule="auto"/>
+      </w:pPr>
+      <w:r>
+        <w:rPr>
+          <w:rFonts w:ascii="Arial" w:hAnsi="Arial"/>
+          <w:b w:val="0"/>
+          <w:i w:val="0"/>
+          <w:color w:val="19263C"/>
+          <w:sz w:val="21"/>
+        </w:rPr>
+        <w:t>SIGAA is a proposed web-based system designed to centralize academic information and transform attendance and grade data into explainable early alerts. The MVP will support academic context management, student profiles, prioritized alerts, and traceable interventions. The project follows Scrum over an 18-week period and uses React, Node.js, PostgreSQL, and Docker. During Sprint 1, the team consolidated the architecture, logical data model, use cases, and a navigable prototype based on synthetic data. The solution still requires validation with an educational stakeholder before production rules can be confirmed.</w:t>
+      </w:r>
+    </w:p>
+    <w:p>
+      <w:pPr>
+        <w:spacing w:before="160" w:after="120"/>
+      </w:pPr>
+      <w:r>
+        <w:rPr>
+          <w:rFonts w:ascii="Arial" w:hAnsi="Arial"/>
+          <w:b/>
+          <w:i w:val="0"/>
+          <w:color w:val="4472C4"/>
+          <w:sz w:val="25"/>
+        </w:rPr>
+        <w:t>Alcance controlado del MVP</w:t>
+      </w:r>
+    </w:p>
+    <w:p>
+      <w:pPr>
+        <w:pStyle w:val="Prrafodelista"/>
+        <w:numPr>
+          <w:ilvl w:val="0"/>
+          <w:numId w:val="3"/>
+        </w:numPr>
+        <w:spacing w:after="60"/>
+      </w:pPr>
+      <w:r>
+        <w:rPr>
+          <w:rFonts w:ascii="Arial" w:hAnsi="Arial"/>
+          <w:b w:val="0"/>
+          <w:i w:val="0"/>
+          <w:color w:val="19263C"/>
+          <w:sz w:val="21"/>
+        </w:rPr>
+        <w:t>Autenticación, roles y autorización por ámbito académico.</w:t>
+      </w:r>
+    </w:p>
+    <w:p>
+      <w:pPr>
+        <w:pStyle w:val="Prrafodelista"/>
+        <w:numPr>
+          <w:ilvl w:val="0"/>
+          <w:numId w:val="3"/>
+        </w:numPr>
+        <w:spacing w:after="60"/>
+      </w:pPr>
+      <w:r>
+        <w:rPr>
+          <w:rFonts w:ascii="Arial" w:hAnsi="Arial"/>
+          <w:b w:val="0"/>
+          <w:i w:val="0"/>
+          <w:color w:val="19263C"/>
+          <w:sz w:val="21"/>
+        </w:rPr>
+        <w:t>Periodos, asignaturas, secciones, estudiantes y matrículas.</w:t>
+      </w:r>
+    </w:p>
+    <w:p>
+      <w:pPr>
+        <w:pStyle w:val="Prrafodelista"/>
+        <w:numPr>
+          <w:ilvl w:val="0"/>
+          <w:numId w:val="3"/>
+        </w:numPr>
+        <w:spacing w:after="60"/>
+      </w:pPr>
+      <w:r>
+        <w:rPr>
+          <w:rFonts w:ascii="Arial" w:hAnsi="Arial"/>
+          <w:b w:val="0"/>
+          <w:i w:val="0"/>
+          <w:color w:val="19263C"/>
+          <w:sz w:val="21"/>
+        </w:rPr>
+        <w:t>Evaluaciones, calificaciones y asistencia con validación.</w:t>
+      </w:r>
+    </w:p>
+    <w:p>
+      <w:pPr>
+        <w:pStyle w:val="Prrafodelista"/>
+        <w:numPr>
+          <w:ilvl w:val="0"/>
+          <w:numId w:val="3"/>
+        </w:numPr>
+        <w:spacing w:after="60"/>
+      </w:pPr>
+      <w:r>
+        <w:rPr>
+          <w:rFonts w:ascii="Arial" w:hAnsi="Arial"/>
+          <w:b w:val="0"/>
+          <w:i w:val="0"/>
+          <w:color w:val="19263C"/>
+          <w:sz w:val="21"/>
+        </w:rPr>
+        <w:t>Reglas versionadas y alertas con umbral, evidencia y severidad.</w:t>
+      </w:r>
+    </w:p>
+    <w:p>
+      <w:pPr>
+        <w:pStyle w:val="Prrafodelista"/>
+        <w:numPr>
+          <w:ilvl w:val="0"/>
+          <w:numId w:val="3"/>
+        </w:numPr>
+        <w:spacing w:after="60"/>
+      </w:pPr>
+      <w:r>
+        <w:rPr>
+          <w:rFonts w:ascii="Arial" w:hAnsi="Arial"/>
+          <w:b w:val="0"/>
+          <w:i w:val="0"/>
+          <w:color w:val="19263C"/>
+          <w:sz w:val="21"/>
+        </w:rPr>
+        <w:t>Asignación, intervención, seguimiento, cierre y auditoría.</w:t>
+      </w:r>
+    </w:p>
+    <w:p>
+      <w:pPr>
+        <w:pStyle w:val="Prrafodelista"/>
+        <w:numPr>
+          <w:ilvl w:val="0"/>
+          <w:numId w:val="3"/>
+        </w:numPr>
+        <w:spacing w:after="60"/>
+      </w:pPr>
+      <w:r>
+        <w:rPr>
+          <w:rFonts w:ascii="Arial" w:hAnsi="Arial"/>
+          <w:b w:val="0"/>
+          <w:i w:val="0"/>
+          <w:color w:val="19263C"/>
+          <w:sz w:val="21"/>
+        </w:rPr>
+        <w:t>Dashboard, ficha del estudiante, reportes básicos y despliegue Docker.</w:t>
+      </w:r>
+    </w:p>
+    <w:p>
+      <w:r>
+        <w:br w:type="page"/>
+      </w:r>
+    </w:p>
+    <w:p>
+      <w:pPr>
+        <w:spacing w:before="240" w:after="120"/>
+      </w:pPr>
+      <w:r>
+        <w:rPr>
+          <w:rFonts w:ascii="Arial" w:hAnsi="Arial"/>
+          <w:b/>
+          <w:i w:val="0"/>
+          <w:color w:val="243F6B"/>
+          <w:sz w:val="34"/>
+        </w:rPr>
+        <w:t>ANEXO B. AVANCE DE DISEÑO - SPRINT 1</w:t>
+      </w:r>
+    </w:p>
+    <w:p>
+      <w:pPr>
+        <w:spacing w:after="120" w:line="259" w:lineRule="auto"/>
+      </w:pPr>
+      <w:r>
+        <w:rPr>
+          <w:rFonts w:ascii="Arial" w:hAnsi="Arial"/>
+          <w:b w:val="0"/>
+          <w:i w:val="0"/>
+          <w:color w:val="19263C"/>
+          <w:sz w:val="21"/>
+        </w:rPr>
+        <w:t>Corte simulado: 28 de agosto de 2026. Los artefactos descritos fueron producidos y verificados; las decisiones de terceros y la validación externa permanecen pendientes.</w:t>
+      </w:r>
+    </w:p>
+    <w:tbl>
+      <w:tblPr>
+        <w:tblW w:type="auto" w:w="0"/>
+        <w:jc w:val="center"/>
+        <w:tblLayout w:type="fixed"/>
+        <w:tblLook w:firstColumn="1" w:firstRow="1" w:lastColumn="0" w:lastRow="0" w:noHBand="0" w:noVBand="1" w:val="04A0"/>
+      </w:tblPr>
+      <w:tblGrid>
+        <w:gridCol w:w="2835"/>
+        <w:gridCol w:w="2835"/>
+        <w:gridCol w:w="2835"/>
+      </w:tblGrid>
+      <w:tr>
+        <w:tc>
+          <w:tcPr>
+            <w:tcW w:type="dxa" w:w="2232"/>
+            <w:vAlign w:val="center"/>
+            <w:tcMar>
+              <w:top w:w="100" w:type="dxa"/>
+              <w:start w:w="120" w:type="dxa"/>
+              <w:bottom w:w="100" w:type="dxa"/>
+              <w:end w:w="120" w:type="dxa"/>
+            </w:tcMar>
+            <w:shd w:fill="243F6B"/>
+          </w:tcPr>
+          <w:p>
+            <w:pPr>
+              <w:spacing w:after="0"/>
+            </w:pPr>
+            <w:r>
+              <w:rPr>
+                <w:rFonts w:ascii="Arial" w:hAnsi="Arial"/>
+                <w:b/>
+                <w:i w:val="0"/>
+                <w:color w:val="FFFFFF"/>
+                <w:sz w:val="18"/>
+              </w:rPr>
+              <w:t>Artefacto</w:t>
+            </w:r>
+          </w:p>
+        </w:tc>
+        <w:tc>
+          <w:tcPr>
+            <w:tcW w:type="dxa" w:w="5976"/>
+            <w:vAlign w:val="center"/>
+            <w:tcMar>
+              <w:top w:w="100" w:type="dxa"/>
+              <w:start w:w="120" w:type="dxa"/>
+              <w:bottom w:w="100" w:type="dxa"/>
+              <w:end w:w="120" w:type="dxa"/>
+            </w:tcMar>
+            <w:shd w:fill="243F6B"/>
+          </w:tcPr>
+          <w:p>
+            <w:pPr>
+              <w:spacing w:after="0"/>
+            </w:pPr>
+            <w:r>
+              <w:rPr>
+                <w:rFonts w:ascii="Arial" w:hAnsi="Arial"/>
+                <w:b/>
+                <w:i w:val="0"/>
+                <w:color w:val="FFFFFF"/>
+                <w:sz w:val="18"/>
+              </w:rPr>
+              <w:t>Resultado</w:t>
+            </w:r>
+          </w:p>
+        </w:tc>
+        <w:tc>
+          <w:tcPr>
+            <w:tcW w:type="dxa" w:w="2232"/>
+            <w:vAlign w:val="center"/>
+            <w:tcMar>
+              <w:top w:w="100" w:type="dxa"/>
+              <w:start w:w="120" w:type="dxa"/>
+              <w:bottom w:w="100" w:type="dxa"/>
+              <w:end w:w="120" w:type="dxa"/>
+            </w:tcMar>
+            <w:shd w:fill="243F6B"/>
+          </w:tcPr>
+          <w:p>
+            <w:pPr>
+              <w:spacing w:after="0"/>
+            </w:pPr>
+            <w:r>
+              <w:rPr>
+                <w:rFonts w:ascii="Arial" w:hAnsi="Arial"/>
+                <w:b/>
+                <w:i w:val="0"/>
+                <w:color w:val="FFFFFF"/>
+                <w:sz w:val="18"/>
+              </w:rPr>
+              <w:t>Estado</w:t>
+            </w:r>
+          </w:p>
+        </w:tc>
+      </w:tr>
+      <w:tr>
+        <w:tc>
+          <w:tcPr>
+            <w:tcW w:type="dxa" w:w="2232"/>
+            <w:vAlign w:val="center"/>
+            <w:tcMar>
+              <w:top w:w="100" w:type="dxa"/>
+              <w:start w:w="120" w:type="dxa"/>
+              <w:bottom w:w="100" w:type="dxa"/>
+              <w:end w:w="120" w:type="dxa"/>
+            </w:tcMar>
+          </w:tcPr>
+          <w:p>
+            <w:pPr>
+              <w:spacing w:after="0"/>
+            </w:pPr>
+            <w:r>
+              <w:rPr>
+                <w:rFonts w:ascii="Arial" w:hAnsi="Arial"/>
+                <w:b w:val="0"/>
+                <w:i w:val="0"/>
+                <w:color w:val="19263C"/>
+                <w:sz w:val="18"/>
+              </w:rPr>
+              <w:t>Arquitectura</w:t>
+            </w:r>
+          </w:p>
+        </w:tc>
+        <w:tc>
+          <w:tcPr>
+            <w:tcW w:type="dxa" w:w="5976"/>
+            <w:vAlign w:val="center"/>
+            <w:tcMar>
+              <w:top w:w="100" w:type="dxa"/>
+              <w:start w:w="120" w:type="dxa"/>
+              <w:bottom w:w="100" w:type="dxa"/>
+              <w:end w:w="120" w:type="dxa"/>
+            </w:tcMar>
+          </w:tcPr>
+          <w:p>
+            <w:pPr>
+              <w:spacing w:after="0"/>
+            </w:pPr>
+            <w:r>
+              <w:rPr>
+                <w:rFonts w:ascii="Arial" w:hAnsi="Arial"/>
+                <w:b w:val="0"/>
+                <w:i w:val="0"/>
+                <w:color w:val="19263C"/>
+                <w:sz w:val="18"/>
+              </w:rPr>
+              <w:t>Contenedores, módulos, interfaces, seguridad y atributos de calidad.</w:t>
+            </w:r>
+          </w:p>
+        </w:tc>
+        <w:tc>
+          <w:tcPr>
+            <w:tcW w:type="dxa" w:w="2232"/>
+            <w:vAlign w:val="center"/>
+            <w:tcMar>
+              <w:top w:w="100" w:type="dxa"/>
+              <w:start w:w="120" w:type="dxa"/>
+              <w:bottom w:w="100" w:type="dxa"/>
+              <w:end w:w="120" w:type="dxa"/>
+            </w:tcMar>
+          </w:tcPr>
+          <w:p>
+            <w:pPr>
+              <w:spacing w:after="0"/>
+            </w:pPr>
+            <w:r>
+              <w:rPr>
+                <w:rFonts w:ascii="Arial" w:hAnsi="Arial"/>
+                <w:b w:val="0"/>
+                <w:i w:val="0"/>
+                <w:color w:val="19263C"/>
+                <w:sz w:val="18"/>
+              </w:rPr>
+              <w:t>Lista para revisión</w:t>
+            </w:r>
+          </w:p>
+        </w:tc>
+      </w:tr>
+      <w:tr>
+        <w:tc>
+          <w:tcPr>
+            <w:tcW w:type="dxa" w:w="2232"/>
+            <w:vAlign w:val="center"/>
+            <w:tcMar>
+              <w:top w:w="100" w:type="dxa"/>
+              <w:start w:w="120" w:type="dxa"/>
+              <w:bottom w:w="100" w:type="dxa"/>
+              <w:end w:w="120" w:type="dxa"/>
+            </w:tcMar>
+            <w:shd w:fill="F2F4F7"/>
+          </w:tcPr>
+          <w:p>
+            <w:pPr>
+              <w:spacing w:after="0"/>
+            </w:pPr>
+            <w:r>
+              <w:rPr>
+                <w:rFonts w:ascii="Arial" w:hAnsi="Arial"/>
+                <w:b w:val="0"/>
+                <w:i w:val="0"/>
+                <w:color w:val="19263C"/>
+                <w:sz w:val="18"/>
+              </w:rPr>
+              <w:t>Modelo de datos</w:t>
+            </w:r>
+          </w:p>
+        </w:tc>
+        <w:tc>
+          <w:tcPr>
+            <w:tcW w:type="dxa" w:w="5976"/>
+            <w:vAlign w:val="center"/>
+            <w:tcMar>
+              <w:top w:w="100" w:type="dxa"/>
+              <w:start w:w="120" w:type="dxa"/>
+              <w:bottom w:w="100" w:type="dxa"/>
+              <w:end w:w="120" w:type="dxa"/>
+            </w:tcMar>
+            <w:shd w:fill="F2F4F7"/>
+          </w:tcPr>
+          <w:p>
+            <w:pPr>
+              <w:spacing w:after="0"/>
+            </w:pPr>
+            <w:r>
+              <w:rPr>
+                <w:rFonts w:ascii="Arial" w:hAnsi="Arial"/>
+                <w:b w:val="0"/>
+                <w:i w:val="0"/>
+                <w:color w:val="19263C"/>
+                <w:sz w:val="18"/>
+              </w:rPr>
+              <w:t>ER lógico, 17 entidades, restricciones e índices previstos.</w:t>
+            </w:r>
+          </w:p>
+        </w:tc>
+        <w:tc>
+          <w:tcPr>
+            <w:tcW w:type="dxa" w:w="2232"/>
+            <w:vAlign w:val="center"/>
+            <w:tcMar>
+              <w:top w:w="100" w:type="dxa"/>
+              <w:start w:w="120" w:type="dxa"/>
+              <w:bottom w:w="100" w:type="dxa"/>
+              <w:end w:w="120" w:type="dxa"/>
+            </w:tcMar>
+            <w:shd w:fill="F2F4F7"/>
+          </w:tcPr>
+          <w:p>
+            <w:pPr>
+              <w:spacing w:after="0"/>
+            </w:pPr>
+            <w:r>
+              <w:rPr>
+                <w:rFonts w:ascii="Arial" w:hAnsi="Arial"/>
+                <w:b w:val="0"/>
+                <w:i w:val="0"/>
+                <w:color w:val="19263C"/>
+                <w:sz w:val="18"/>
+              </w:rPr>
+              <w:t>Lista para revisión</w:t>
+            </w:r>
+          </w:p>
+        </w:tc>
+      </w:tr>
+      <w:tr>
+        <w:tc>
+          <w:tcPr>
+            <w:tcW w:type="dxa" w:w="2232"/>
+            <w:vAlign w:val="center"/>
+            <w:tcMar>
+              <w:top w:w="100" w:type="dxa"/>
+              <w:start w:w="120" w:type="dxa"/>
+              <w:bottom w:w="100" w:type="dxa"/>
+              <w:end w:w="120" w:type="dxa"/>
+            </w:tcMar>
+          </w:tcPr>
+          <w:p>
+            <w:pPr>
+              <w:spacing w:after="0"/>
+            </w:pPr>
+            <w:r>
+              <w:rPr>
+                <w:rFonts w:ascii="Arial" w:hAnsi="Arial"/>
+                <w:b w:val="0"/>
+                <w:i w:val="0"/>
+                <w:color w:val="19263C"/>
+                <w:sz w:val="18"/>
+              </w:rPr>
+              <w:t>UML</w:t>
+            </w:r>
+          </w:p>
+        </w:tc>
+        <w:tc>
+          <w:tcPr>
+            <w:tcW w:type="dxa" w:w="5976"/>
+            <w:vAlign w:val="center"/>
+            <w:tcMar>
+              <w:top w:w="100" w:type="dxa"/>
+              <w:start w:w="120" w:type="dxa"/>
+              <w:bottom w:w="100" w:type="dxa"/>
+              <w:end w:w="120" w:type="dxa"/>
+            </w:tcMar>
+          </w:tcPr>
+          <w:p>
+            <w:pPr>
+              <w:spacing w:after="0"/>
+            </w:pPr>
+            <w:r>
+              <w:rPr>
+                <w:rFonts w:ascii="Arial" w:hAnsi="Arial"/>
+                <w:b w:val="0"/>
+                <w:i w:val="0"/>
+                <w:color w:val="19263C"/>
+                <w:sz w:val="18"/>
+              </w:rPr>
+              <w:t>Actores, casos de uso, secuencia de alerta y estados.</w:t>
+            </w:r>
+          </w:p>
+        </w:tc>
+        <w:tc>
+          <w:tcPr>
+            <w:tcW w:type="dxa" w:w="2232"/>
+            <w:vAlign w:val="center"/>
+            <w:tcMar>
+              <w:top w:w="100" w:type="dxa"/>
+              <w:start w:w="120" w:type="dxa"/>
+              <w:bottom w:w="100" w:type="dxa"/>
+              <w:end w:w="120" w:type="dxa"/>
+            </w:tcMar>
+          </w:tcPr>
+          <w:p>
+            <w:pPr>
+              <w:spacing w:after="0"/>
+            </w:pPr>
+            <w:r>
+              <w:rPr>
+                <w:rFonts w:ascii="Arial" w:hAnsi="Arial"/>
+                <w:b w:val="0"/>
+                <w:i w:val="0"/>
+                <w:color w:val="19263C"/>
+                <w:sz w:val="18"/>
+              </w:rPr>
+              <w:t>Lista para revisión</w:t>
+            </w:r>
+          </w:p>
+        </w:tc>
+      </w:tr>
+      <w:tr>
+        <w:tc>
+          <w:tcPr>
+            <w:tcW w:type="dxa" w:w="2232"/>
+            <w:vAlign w:val="center"/>
+            <w:tcMar>
+              <w:top w:w="100" w:type="dxa"/>
+              <w:start w:w="120" w:type="dxa"/>
+              <w:bottom w:w="100" w:type="dxa"/>
+              <w:end w:w="120" w:type="dxa"/>
+            </w:tcMar>
+            <w:shd w:fill="F2F4F7"/>
+          </w:tcPr>
+          <w:p>
+            <w:pPr>
+              <w:spacing w:after="0"/>
+            </w:pPr>
+            <w:r>
+              <w:rPr>
+                <w:rFonts w:ascii="Arial" w:hAnsi="Arial"/>
+                <w:b w:val="0"/>
+                <w:i w:val="0"/>
+                <w:color w:val="19263C"/>
+                <w:sz w:val="18"/>
+              </w:rPr>
+              <w:t>Prototipo</w:t>
+            </w:r>
+          </w:p>
+        </w:tc>
+        <w:tc>
+          <w:tcPr>
+            <w:tcW w:type="dxa" w:w="5976"/>
+            <w:vAlign w:val="center"/>
+            <w:tcMar>
+              <w:top w:w="100" w:type="dxa"/>
+              <w:start w:w="120" w:type="dxa"/>
+              <w:bottom w:w="100" w:type="dxa"/>
+              <w:end w:w="120" w:type="dxa"/>
+            </w:tcMar>
+            <w:shd w:fill="F2F4F7"/>
+          </w:tcPr>
+          <w:p>
+            <w:pPr>
+              <w:spacing w:after="0"/>
+            </w:pPr>
+            <w:r>
+              <w:rPr>
+                <w:rFonts w:ascii="Arial" w:hAnsi="Arial"/>
+                <w:b w:val="0"/>
+                <w:i w:val="0"/>
+                <w:color w:val="19263C"/>
+                <w:sz w:val="18"/>
+              </w:rPr>
+              <w:t>Acceso demo, dashboard, estudiantes, ficha y alertas.</w:t>
+            </w:r>
+          </w:p>
+        </w:tc>
+        <w:tc>
+          <w:tcPr>
+            <w:tcW w:type="dxa" w:w="2232"/>
+            <w:vAlign w:val="center"/>
+            <w:tcMar>
+              <w:top w:w="100" w:type="dxa"/>
+              <w:start w:w="120" w:type="dxa"/>
+              <w:bottom w:w="100" w:type="dxa"/>
+              <w:end w:w="120" w:type="dxa"/>
+            </w:tcMar>
+            <w:shd w:fill="F2F4F7"/>
+          </w:tcPr>
+          <w:p>
+            <w:pPr>
+              <w:spacing w:after="0"/>
+            </w:pPr>
+            <w:r>
+              <w:rPr>
+                <w:rFonts w:ascii="Arial" w:hAnsi="Arial"/>
+                <w:b w:val="0"/>
+                <w:i w:val="0"/>
+                <w:color w:val="19263C"/>
+                <w:sz w:val="18"/>
+              </w:rPr>
+              <w:t>Verificado internamente</w:t>
+            </w:r>
+          </w:p>
+        </w:tc>
+      </w:tr>
+      <w:tr>
+        <w:tc>
+          <w:tcPr>
+            <w:tcW w:type="dxa" w:w="2232"/>
+            <w:vAlign w:val="center"/>
+            <w:tcMar>
+              <w:top w:w="100" w:type="dxa"/>
+              <w:start w:w="120" w:type="dxa"/>
+              <w:bottom w:w="100" w:type="dxa"/>
+              <w:end w:w="120" w:type="dxa"/>
+            </w:tcMar>
+          </w:tcPr>
+          <w:p>
+            <w:pPr>
+              <w:spacing w:after="0"/>
+            </w:pPr>
+            <w:r>
+              <w:rPr>
+                <w:rFonts w:ascii="Arial" w:hAnsi="Arial"/>
+                <w:b w:val="0"/>
+                <w:i w:val="0"/>
+                <w:color w:val="19263C"/>
+                <w:sz w:val="18"/>
+              </w:rPr>
+              <w:t>Calidad</w:t>
+            </w:r>
+          </w:p>
+        </w:tc>
+        <w:tc>
+          <w:tcPr>
+            <w:tcW w:type="dxa" w:w="5976"/>
+            <w:vAlign w:val="center"/>
+            <w:tcMar>
+              <w:top w:w="100" w:type="dxa"/>
+              <w:start w:w="120" w:type="dxa"/>
+              <w:bottom w:w="100" w:type="dxa"/>
+              <w:end w:w="120" w:type="dxa"/>
+            </w:tcMar>
+          </w:tcPr>
+          <w:p>
+            <w:pPr>
+              <w:spacing w:after="0"/>
+            </w:pPr>
+            <w:r>
+              <w:rPr>
+                <w:rFonts w:ascii="Arial" w:hAnsi="Arial"/>
+                <w:b w:val="0"/>
+                <w:i w:val="0"/>
+                <w:color w:val="19263C"/>
+                <w:sz w:val="18"/>
+              </w:rPr>
+              <w:t>6 pruebas API, build web, Docker saludable y consola sin errores.</w:t>
+            </w:r>
+          </w:p>
+        </w:tc>
+        <w:tc>
+          <w:tcPr>
+            <w:tcW w:type="dxa" w:w="2232"/>
+            <w:vAlign w:val="center"/>
+            <w:tcMar>
+              <w:top w:w="100" w:type="dxa"/>
+              <w:start w:w="120" w:type="dxa"/>
+              <w:bottom w:w="100" w:type="dxa"/>
+              <w:end w:w="120" w:type="dxa"/>
+            </w:tcMar>
+          </w:tcPr>
+          <w:p>
+            <w:pPr>
+              <w:spacing w:after="0"/>
+            </w:pPr>
+            <w:r>
+              <w:rPr>
+                <w:rFonts w:ascii="Arial" w:hAnsi="Arial"/>
+                <w:b w:val="0"/>
+                <w:i w:val="0"/>
+                <w:color w:val="19263C"/>
+                <w:sz w:val="18"/>
+              </w:rPr>
+              <w:t>Aprobada internamente</w:t>
+            </w:r>
+          </w:p>
+        </w:tc>
+      </w:tr>
+    </w:tbl>
+    <w:p>
+      <w:pPr>
+        <w:spacing w:before="160" w:after="120"/>
+      </w:pPr>
+      <w:r>
+        <w:rPr>
+          <w:rFonts w:ascii="Arial" w:hAnsi="Arial"/>
+          <w:b/>
+          <w:i w:val="0"/>
+          <w:color w:val="4472C4"/>
+          <w:sz w:val="25"/>
+        </w:rPr>
+        <w:t>Prototipo navegable</w:t>
+      </w:r>
+    </w:p>
+    <w:p>
+      <w:pPr>
+        <w:spacing w:after="120" w:line="259" w:lineRule="auto"/>
+      </w:pPr>
+      <w:r>
+        <w:rPr>
+          <w:rFonts w:ascii="Arial" w:hAnsi="Arial"/>
+          <w:b w:val="0"/>
+          <w:i w:val="0"/>
+          <w:color w:val="19263C"/>
+          <w:sz w:val="21"/>
+        </w:rPr>
+        <w:t>La siguiente captura utiliza datos sintéticos y demuestra la jerarquía visual propuesta; no representa autenticación ni persistencia productivas.</w:t>
+      </w:r>
+    </w:p>
+    <w:p>
+      <w:pPr>
+        <w:keepNext/>
+        <w:jc w:val="center"/>
+      </w:pPr>
+      <w:r>
+        <w:drawing>
+          <wp:inline xmlns:a="http://schemas.openxmlformats.org/drawingml/2006/main" xmlns:pic="http://schemas.openxmlformats.org/drawingml/2006/picture">
+            <wp:extent cx="6537960" cy="4086225"/>
+            <wp:docPr id="48" name="Picture 48"/>
+            <wp:cNvGraphicFramePr>
+              <a:graphicFrameLocks noChangeAspect="1"/>
+            </wp:cNvGraphicFramePr>
+            <a:graphic>
+              <a:graphicData uri="http://schemas.openxmlformats.org/drawingml/2006/picture">
+                <pic:pic>
+                  <pic:nvPicPr>
+                    <pic:cNvPr id="0" name="prototipo-dashboard.png"/>
+                    <pic:cNvPicPr/>
+                  </pic:nvPicPr>
+                  <pic:blipFill>
+                    <a:blip r:embed="rId13"/>
+                    <a:stretch>
+                      <a:fillRect/>
+                    </a:stretch>
+                  </pic:blipFill>
+                  <pic:spPr>
+                    <a:xfrm>
+                      <a:off x="0" y="0"/>
+                      <a:ext cx="6537960" cy="4086225"/>
+                    </a:xfrm>
+                    <a:prstGeom prst="rect"/>
+                  </pic:spPr>
+                </pic:pic>
+              </a:graphicData>
+            </a:graphic>
+          </wp:inline>
+        </w:drawing>
+      </w:r>
+    </w:p>
+    <w:p>
+      <w:pPr>
+        <w:jc w:val="center"/>
+      </w:pPr>
+      <w:r>
+        <w:rPr>
+          <w:rFonts w:ascii="Arial" w:hAnsi="Arial"/>
+          <w:b w:val="0"/>
+          <w:i/>
+          <w:color w:val="5C6978"/>
+          <w:sz w:val="17"/>
+        </w:rPr>
+        <w:t>Figura 1. Dashboard del prototipo SIGAA - Sprint 1.</w:t>
+      </w:r>
+    </w:p>
+    <w:p>
+      <w:pPr>
+        <w:spacing w:before="960" w:after="120"/>
+      </w:pPr>
+      <w:r>
+        <w:rPr>
+          <w:rFonts w:ascii="Arial" w:hAnsi="Arial"/>
+          <w:b/>
+          <w:i w:val="0"/>
+          <w:color w:val="243F6B"/>
+          <w:sz w:val="34"/>
+        </w:rPr>
+        <w:t>ANEXO C. DECISIONES TÉCNICAS Y TRAZABILIDAD</w:t>
+      </w:r>
+    </w:p>
+    <w:p>
+      <w:pPr>
+        <w:spacing w:before="160" w:after="120"/>
+      </w:pPr>
+      <w:r>
+        <w:rPr>
+          <w:rFonts w:ascii="Arial" w:hAnsi="Arial"/>
+          <w:b/>
+          <w:i w:val="0"/>
+          <w:color w:val="4472C4"/>
+          <w:sz w:val="25"/>
+        </w:rPr>
+        <w:t>Arquitectura seleccionada</w:t>
+      </w:r>
+    </w:p>
+    <w:p>
+      <w:pPr>
+        <w:spacing w:after="120" w:line="259" w:lineRule="auto"/>
+      </w:pPr>
+      <w:r>
+        <w:rPr>
+          <w:rFonts w:ascii="Arial" w:hAnsi="Arial"/>
+          <w:b w:val="0"/>
+          <w:i w:val="0"/>
+          <w:color w:val="19263C"/>
+          <w:sz w:val="21"/>
+        </w:rPr>
+        <w:t>La solución mantiene tres contenedores principales: web React servida por Nginx, API Node.js con Express y PostgreSQL 16. El motor de alertas, auditoría y notificaciones comienzan como módulos internos de la API para reducir complejidad y podrán separarse según evidencia de carga o mantenibilidad.</w:t>
+      </w:r>
+    </w:p>
+    <w:tbl>
+      <w:tblPr>
+        <w:tblW w:type="auto" w:w="0"/>
+        <w:jc w:val="center"/>
+        <w:tblLayout w:type="fixed"/>
+        <w:tblLook w:firstColumn="1" w:firstRow="1" w:lastColumn="0" w:lastRow="0" w:noHBand="0" w:noVBand="1" w:val="04A0"/>
+      </w:tblPr>
+      <w:tblGrid>
+        <w:gridCol w:w="2835"/>
+        <w:gridCol w:w="2835"/>
+        <w:gridCol w:w="2835"/>
+      </w:tblGrid>
+      <w:tr>
+        <w:tc>
+          <w:tcPr>
+            <w:tcW w:type="dxa" w:w="1944"/>
+            <w:vAlign w:val="center"/>
+            <w:tcMar>
+              <w:top w:w="100" w:type="dxa"/>
+              <w:start w:w="120" w:type="dxa"/>
+              <w:bottom w:w="100" w:type="dxa"/>
+              <w:end w:w="120" w:type="dxa"/>
+            </w:tcMar>
+            <w:shd w:fill="243F6B"/>
+          </w:tcPr>
+          <w:p>
+            <w:pPr>
+              <w:spacing w:after="0"/>
+            </w:pPr>
+            <w:r>
+              <w:rPr>
+                <w:rFonts w:ascii="Arial" w:hAnsi="Arial"/>
+                <w:b/>
+                <w:i w:val="0"/>
+                <w:color w:val="FFFFFF"/>
+                <w:sz w:val="18"/>
+              </w:rPr>
+              <w:t>Grupo</w:t>
+            </w:r>
+          </w:p>
+        </w:tc>
+        <w:tc>
+          <w:tcPr>
+            <w:tcW w:type="dxa" w:w="5256"/>
+            <w:vAlign w:val="center"/>
+            <w:tcMar>
+              <w:top w:w="100" w:type="dxa"/>
+              <w:start w:w="120" w:type="dxa"/>
+              <w:bottom w:w="100" w:type="dxa"/>
+              <w:end w:w="120" w:type="dxa"/>
+            </w:tcMar>
+            <w:shd w:fill="243F6B"/>
+          </w:tcPr>
+          <w:p>
+            <w:pPr>
+              <w:spacing w:after="0"/>
+            </w:pPr>
+            <w:r>
+              <w:rPr>
+                <w:rFonts w:ascii="Arial" w:hAnsi="Arial"/>
+                <w:b/>
+                <w:i w:val="0"/>
+                <w:color w:val="FFFFFF"/>
+                <w:sz w:val="18"/>
+              </w:rPr>
+              <w:t>Entidades principales</w:t>
+            </w:r>
+          </w:p>
+        </w:tc>
+        <w:tc>
+          <w:tcPr>
+            <w:tcW w:type="dxa" w:w="3240"/>
+            <w:vAlign w:val="center"/>
+            <w:tcMar>
+              <w:top w:w="100" w:type="dxa"/>
+              <w:start w:w="120" w:type="dxa"/>
+              <w:bottom w:w="100" w:type="dxa"/>
+              <w:end w:w="120" w:type="dxa"/>
+            </w:tcMar>
+            <w:shd w:fill="243F6B"/>
+          </w:tcPr>
+          <w:p>
+            <w:pPr>
+              <w:spacing w:after="0"/>
+            </w:pPr>
+            <w:r>
+              <w:rPr>
+                <w:rFonts w:ascii="Arial" w:hAnsi="Arial"/>
+                <w:b/>
+                <w:i w:val="0"/>
+                <w:color w:val="FFFFFF"/>
+                <w:sz w:val="18"/>
+              </w:rPr>
+              <w:t>Propósito</w:t>
+            </w:r>
+          </w:p>
+        </w:tc>
+      </w:tr>
+      <w:tr>
+        <w:tc>
+          <w:tcPr>
+            <w:tcW w:type="dxa" w:w="1944"/>
+            <w:vAlign w:val="center"/>
+            <w:tcMar>
+              <w:top w:w="100" w:type="dxa"/>
+              <w:start w:w="120" w:type="dxa"/>
+              <w:bottom w:w="100" w:type="dxa"/>
+              <w:end w:w="120" w:type="dxa"/>
+            </w:tcMar>
+          </w:tcPr>
+          <w:p>
+            <w:pPr>
+              <w:spacing w:after="0"/>
+            </w:pPr>
+            <w:r>
+              <w:rPr>
+                <w:rFonts w:ascii="Arial" w:hAnsi="Arial"/>
+                <w:b w:val="0"/>
+                <w:i w:val="0"/>
+                <w:color w:val="19263C"/>
+                <w:sz w:val="18"/>
+              </w:rPr>
+              <w:t>Identidad</w:t>
+            </w:r>
+          </w:p>
+        </w:tc>
+        <w:tc>
+          <w:tcPr>
+            <w:tcW w:type="dxa" w:w="5256"/>
+            <w:vAlign w:val="center"/>
+            <w:tcMar>
+              <w:top w:w="100" w:type="dxa"/>
+              <w:start w:w="120" w:type="dxa"/>
+              <w:bottom w:w="100" w:type="dxa"/>
+              <w:end w:w="120" w:type="dxa"/>
+            </w:tcMar>
+          </w:tcPr>
+          <w:p>
+            <w:pPr>
+              <w:spacing w:after="0"/>
+            </w:pPr>
+            <w:r>
+              <w:rPr>
+                <w:rFonts w:ascii="Arial" w:hAnsi="Arial"/>
+                <w:b w:val="0"/>
+                <w:i w:val="0"/>
+                <w:color w:val="19263C"/>
+                <w:sz w:val="18"/>
+              </w:rPr>
+              <w:t>usuario, rol, usuario_rol</w:t>
+            </w:r>
+          </w:p>
+        </w:tc>
+        <w:tc>
+          <w:tcPr>
+            <w:tcW w:type="dxa" w:w="3240"/>
+            <w:vAlign w:val="center"/>
+            <w:tcMar>
+              <w:top w:w="100" w:type="dxa"/>
+              <w:start w:w="120" w:type="dxa"/>
+              <w:bottom w:w="100" w:type="dxa"/>
+              <w:end w:w="120" w:type="dxa"/>
+            </w:tcMar>
+          </w:tcPr>
+          <w:p>
+            <w:pPr>
+              <w:spacing w:after="0"/>
+            </w:pPr>
+            <w:r>
+              <w:rPr>
+                <w:rFonts w:ascii="Arial" w:hAnsi="Arial"/>
+                <w:b w:val="0"/>
+                <w:i w:val="0"/>
+                <w:color w:val="19263C"/>
+                <w:sz w:val="18"/>
+              </w:rPr>
+              <w:t>Acceso y mínimo privilegio</w:t>
+            </w:r>
+          </w:p>
+        </w:tc>
+      </w:tr>
+      <w:tr>
+        <w:tc>
+          <w:tcPr>
+            <w:tcW w:type="dxa" w:w="1944"/>
+            <w:vAlign w:val="center"/>
+            <w:tcMar>
+              <w:top w:w="100" w:type="dxa"/>
+              <w:start w:w="120" w:type="dxa"/>
+              <w:bottom w:w="100" w:type="dxa"/>
+              <w:end w:w="120" w:type="dxa"/>
+            </w:tcMar>
+            <w:shd w:fill="F2F4F7"/>
+          </w:tcPr>
+          <w:p>
+            <w:pPr>
+              <w:spacing w:after="0"/>
+            </w:pPr>
+            <w:r>
+              <w:rPr>
+                <w:rFonts w:ascii="Arial" w:hAnsi="Arial"/>
+                <w:b w:val="0"/>
+                <w:i w:val="0"/>
+                <w:color w:val="19263C"/>
+                <w:sz w:val="18"/>
+              </w:rPr>
+              <w:t>Académico</w:t>
+            </w:r>
+          </w:p>
+        </w:tc>
+        <w:tc>
+          <w:tcPr>
+            <w:tcW w:type="dxa" w:w="5256"/>
+            <w:vAlign w:val="center"/>
+            <w:tcMar>
+              <w:top w:w="100" w:type="dxa"/>
+              <w:start w:w="120" w:type="dxa"/>
+              <w:bottom w:w="100" w:type="dxa"/>
+              <w:end w:w="120" w:type="dxa"/>
+            </w:tcMar>
+            <w:shd w:fill="F2F4F7"/>
+          </w:tcPr>
+          <w:p>
+            <w:pPr>
+              <w:spacing w:after="0"/>
+            </w:pPr>
+            <w:r>
+              <w:rPr>
+                <w:rFonts w:ascii="Arial" w:hAnsi="Arial"/>
+                <w:b w:val="0"/>
+                <w:i w:val="0"/>
+                <w:color w:val="19263C"/>
+                <w:sz w:val="18"/>
+              </w:rPr>
+              <w:t>periodo, asignatura, sección, matrícula</w:t>
+            </w:r>
+          </w:p>
+        </w:tc>
+        <w:tc>
+          <w:tcPr>
+            <w:tcW w:type="dxa" w:w="3240"/>
+            <w:vAlign w:val="center"/>
+            <w:tcMar>
+              <w:top w:w="100" w:type="dxa"/>
+              <w:start w:w="120" w:type="dxa"/>
+              <w:bottom w:w="100" w:type="dxa"/>
+              <w:end w:w="120" w:type="dxa"/>
+            </w:tcMar>
+            <w:shd w:fill="F2F4F7"/>
+          </w:tcPr>
+          <w:p>
+            <w:pPr>
+              <w:spacing w:after="0"/>
+            </w:pPr>
+            <w:r>
+              <w:rPr>
+                <w:rFonts w:ascii="Arial" w:hAnsi="Arial"/>
+                <w:b w:val="0"/>
+                <w:i w:val="0"/>
+                <w:color w:val="19263C"/>
+                <w:sz w:val="18"/>
+              </w:rPr>
+              <w:t>Contexto y pertenencia</w:t>
+            </w:r>
+          </w:p>
+        </w:tc>
+      </w:tr>
+      <w:tr>
+        <w:tc>
+          <w:tcPr>
+            <w:tcW w:type="dxa" w:w="1944"/>
+            <w:vAlign w:val="center"/>
+            <w:tcMar>
+              <w:top w:w="100" w:type="dxa"/>
+              <w:start w:w="120" w:type="dxa"/>
+              <w:bottom w:w="100" w:type="dxa"/>
+              <w:end w:w="120" w:type="dxa"/>
+            </w:tcMar>
+          </w:tcPr>
+          <w:p>
+            <w:pPr>
+              <w:spacing w:after="0"/>
+            </w:pPr>
+            <w:r>
+              <w:rPr>
+                <w:rFonts w:ascii="Arial" w:hAnsi="Arial"/>
+                <w:b w:val="0"/>
+                <w:i w:val="0"/>
+                <w:color w:val="19263C"/>
+                <w:sz w:val="18"/>
+              </w:rPr>
+              <w:t>Evidencia</w:t>
+            </w:r>
+          </w:p>
+        </w:tc>
+        <w:tc>
+          <w:tcPr>
+            <w:tcW w:type="dxa" w:w="5256"/>
+            <w:vAlign w:val="center"/>
+            <w:tcMar>
+              <w:top w:w="100" w:type="dxa"/>
+              <w:start w:w="120" w:type="dxa"/>
+              <w:bottom w:w="100" w:type="dxa"/>
+              <w:end w:w="120" w:type="dxa"/>
+            </w:tcMar>
+          </w:tcPr>
+          <w:p>
+            <w:pPr>
+              <w:spacing w:after="0"/>
+            </w:pPr>
+            <w:r>
+              <w:rPr>
+                <w:rFonts w:ascii="Arial" w:hAnsi="Arial"/>
+                <w:b w:val="0"/>
+                <w:i w:val="0"/>
+                <w:color w:val="19263C"/>
+                <w:sz w:val="18"/>
+              </w:rPr>
+              <w:t>evaluación, calificación, sesión, asistencia</w:t>
+            </w:r>
+          </w:p>
+        </w:tc>
+        <w:tc>
+          <w:tcPr>
+            <w:tcW w:type="dxa" w:w="3240"/>
+            <w:vAlign w:val="center"/>
+            <w:tcMar>
+              <w:top w:w="100" w:type="dxa"/>
+              <w:start w:w="120" w:type="dxa"/>
+              <w:bottom w:w="100" w:type="dxa"/>
+              <w:end w:w="120" w:type="dxa"/>
+            </w:tcMar>
+          </w:tcPr>
+          <w:p>
+            <w:pPr>
+              <w:spacing w:after="0"/>
+            </w:pPr>
+            <w:r>
+              <w:rPr>
+                <w:rFonts w:ascii="Arial" w:hAnsi="Arial"/>
+                <w:b w:val="0"/>
+                <w:i w:val="0"/>
+                <w:color w:val="19263C"/>
+                <w:sz w:val="18"/>
+              </w:rPr>
+              <w:t>Datos observables</w:t>
+            </w:r>
+          </w:p>
+        </w:tc>
+      </w:tr>
+      <w:tr>
+        <w:tc>
+          <w:tcPr>
+            <w:tcW w:type="dxa" w:w="1944"/>
+            <w:vAlign w:val="center"/>
+            <w:tcMar>
+              <w:top w:w="100" w:type="dxa"/>
+              <w:start w:w="120" w:type="dxa"/>
+              <w:bottom w:w="100" w:type="dxa"/>
+              <w:end w:w="120" w:type="dxa"/>
+            </w:tcMar>
+            <w:shd w:fill="F2F4F7"/>
+          </w:tcPr>
+          <w:p>
+            <w:pPr>
+              <w:spacing w:after="0"/>
+            </w:pPr>
+            <w:r>
+              <w:rPr>
+                <w:rFonts w:ascii="Arial" w:hAnsi="Arial"/>
+                <w:b w:val="0"/>
+                <w:i w:val="0"/>
+                <w:color w:val="19263C"/>
+                <w:sz w:val="18"/>
+              </w:rPr>
+              <w:t>Seguimiento</w:t>
+            </w:r>
+          </w:p>
+        </w:tc>
+        <w:tc>
+          <w:tcPr>
+            <w:tcW w:type="dxa" w:w="5256"/>
+            <w:vAlign w:val="center"/>
+            <w:tcMar>
+              <w:top w:w="100" w:type="dxa"/>
+              <w:start w:w="120" w:type="dxa"/>
+              <w:bottom w:w="100" w:type="dxa"/>
+              <w:end w:w="120" w:type="dxa"/>
+            </w:tcMar>
+            <w:shd w:fill="F2F4F7"/>
+          </w:tcPr>
+          <w:p>
+            <w:pPr>
+              <w:spacing w:after="0"/>
+            </w:pPr>
+            <w:r>
+              <w:rPr>
+                <w:rFonts w:ascii="Arial" w:hAnsi="Arial"/>
+                <w:b w:val="0"/>
+                <w:i w:val="0"/>
+                <w:color w:val="19263C"/>
+                <w:sz w:val="18"/>
+              </w:rPr>
+              <w:t>regla_alerta, alerta, intervención</w:t>
+            </w:r>
+          </w:p>
+        </w:tc>
+        <w:tc>
+          <w:tcPr>
+            <w:tcW w:type="dxa" w:w="3240"/>
+            <w:vAlign w:val="center"/>
+            <w:tcMar>
+              <w:top w:w="100" w:type="dxa"/>
+              <w:start w:w="120" w:type="dxa"/>
+              <w:bottom w:w="100" w:type="dxa"/>
+              <w:end w:w="120" w:type="dxa"/>
+            </w:tcMar>
+            <w:shd w:fill="F2F4F7"/>
+          </w:tcPr>
+          <w:p>
+            <w:pPr>
+              <w:spacing w:after="0"/>
+            </w:pPr>
+            <w:r>
+              <w:rPr>
+                <w:rFonts w:ascii="Arial" w:hAnsi="Arial"/>
+                <w:b w:val="0"/>
+                <w:i w:val="0"/>
+                <w:color w:val="19263C"/>
+                <w:sz w:val="18"/>
+              </w:rPr>
+              <w:t>Explicación y acción</w:t>
+            </w:r>
+          </w:p>
+        </w:tc>
+      </w:tr>
+      <w:tr>
+        <w:tc>
+          <w:tcPr>
+            <w:tcW w:type="dxa" w:w="1944"/>
+            <w:vAlign w:val="center"/>
+            <w:tcMar>
+              <w:top w:w="100" w:type="dxa"/>
+              <w:start w:w="120" w:type="dxa"/>
+              <w:bottom w:w="100" w:type="dxa"/>
+              <w:end w:w="120" w:type="dxa"/>
+            </w:tcMar>
+          </w:tcPr>
+          <w:p>
+            <w:pPr>
+              <w:spacing w:after="0"/>
+            </w:pPr>
+            <w:r>
+              <w:rPr>
+                <w:rFonts w:ascii="Arial" w:hAnsi="Arial"/>
+                <w:b w:val="0"/>
+                <w:i w:val="0"/>
+                <w:color w:val="19263C"/>
+                <w:sz w:val="18"/>
+              </w:rPr>
+              <w:t>Control</w:t>
+            </w:r>
+          </w:p>
+        </w:tc>
+        <w:tc>
+          <w:tcPr>
+            <w:tcW w:type="dxa" w:w="5256"/>
+            <w:vAlign w:val="center"/>
+            <w:tcMar>
+              <w:top w:w="100" w:type="dxa"/>
+              <w:start w:w="120" w:type="dxa"/>
+              <w:bottom w:w="100" w:type="dxa"/>
+              <w:end w:w="120" w:type="dxa"/>
+            </w:tcMar>
+          </w:tcPr>
+          <w:p>
+            <w:pPr>
+              <w:spacing w:after="0"/>
+            </w:pPr>
+            <w:r>
+              <w:rPr>
+                <w:rFonts w:ascii="Arial" w:hAnsi="Arial"/>
+                <w:b w:val="0"/>
+                <w:i w:val="0"/>
+                <w:color w:val="19263C"/>
+                <w:sz w:val="18"/>
+              </w:rPr>
+              <w:t>evento_auditoria</w:t>
+            </w:r>
+          </w:p>
+        </w:tc>
+        <w:tc>
+          <w:tcPr>
+            <w:tcW w:type="dxa" w:w="3240"/>
+            <w:vAlign w:val="center"/>
+            <w:tcMar>
+              <w:top w:w="100" w:type="dxa"/>
+              <w:start w:w="120" w:type="dxa"/>
+              <w:bottom w:w="100" w:type="dxa"/>
+              <w:end w:w="120" w:type="dxa"/>
+            </w:tcMar>
+          </w:tcPr>
+          <w:p>
+            <w:pPr>
+              <w:spacing w:after="0"/>
+            </w:pPr>
+            <w:r>
+              <w:rPr>
+                <w:rFonts w:ascii="Arial" w:hAnsi="Arial"/>
+                <w:b w:val="0"/>
+                <w:i w:val="0"/>
+                <w:color w:val="19263C"/>
+                <w:sz w:val="18"/>
+              </w:rPr>
+              <w:t>Trazabilidad de cambios</w:t>
+            </w:r>
+          </w:p>
+        </w:tc>
+      </w:tr>
+    </w:tbl>
+    <w:p>
+      <w:pPr>
+        <w:spacing w:before="160" w:after="120"/>
+      </w:pPr>
+      <w:r>
+        <w:rPr>
+          <w:rFonts w:ascii="Arial" w:hAnsi="Arial"/>
+          <w:b/>
+          <w:i w:val="0"/>
+          <w:color w:val="4472C4"/>
+          <w:sz w:val="25"/>
+        </w:rPr>
+        <w:t>Criterios que guían la implementación</w:t>
+      </w:r>
+    </w:p>
+    <w:p>
+      <w:pPr>
+        <w:pStyle w:val="Prrafodelista"/>
+        <w:numPr>
+          <w:ilvl w:val="0"/>
+          <w:numId w:val="3"/>
+        </w:numPr>
+        <w:spacing w:after="60"/>
+      </w:pPr>
+      <w:r>
+        <w:rPr>
+          <w:rFonts w:ascii="Arial" w:hAnsi="Arial"/>
+          <w:b w:val="0"/>
+          <w:i w:val="0"/>
+          <w:color w:val="19263C"/>
+          <w:sz w:val="21"/>
+        </w:rPr>
+        <w:t>Una alerta histórica conserva la versión de la regla y la evidencia que la originaron.</w:t>
+      </w:r>
+    </w:p>
+    <w:p>
+      <w:pPr>
+        <w:pStyle w:val="Prrafodelista"/>
+        <w:numPr>
+          <w:ilvl w:val="0"/>
+          <w:numId w:val="3"/>
+        </w:numPr>
+        <w:spacing w:after="60"/>
+      </w:pPr>
+      <w:r>
+        <w:rPr>
+          <w:rFonts w:ascii="Arial" w:hAnsi="Arial"/>
+          <w:b w:val="0"/>
+          <w:i w:val="0"/>
+          <w:color w:val="19263C"/>
+          <w:sz w:val="21"/>
+        </w:rPr>
+        <w:t>Los permisos se aplican en la API, no únicamente en la interfaz.</w:t>
+      </w:r>
+    </w:p>
+    <w:p>
+      <w:pPr>
+        <w:pStyle w:val="Prrafodelista"/>
+        <w:numPr>
+          <w:ilvl w:val="0"/>
+          <w:numId w:val="3"/>
+        </w:numPr>
+        <w:spacing w:after="60"/>
+      </w:pPr>
+      <w:r>
+        <w:rPr>
+          <w:rFonts w:ascii="Arial" w:hAnsi="Arial"/>
+          <w:b w:val="0"/>
+          <w:i w:val="0"/>
+          <w:color w:val="19263C"/>
+          <w:sz w:val="21"/>
+        </w:rPr>
+        <w:t>Los ambientes de desarrollo y demostración utilizan datos sintéticos.</w:t>
+      </w:r>
+    </w:p>
+    <w:p>
+      <w:pPr>
+        <w:pStyle w:val="Prrafodelista"/>
+        <w:numPr>
+          <w:ilvl w:val="0"/>
+          <w:numId w:val="3"/>
+        </w:numPr>
+        <w:spacing w:after="60"/>
+      </w:pPr>
+      <w:r>
+        <w:rPr>
+          <w:rFonts w:ascii="Arial" w:hAnsi="Arial"/>
+          <w:b w:val="0"/>
+          <w:i w:val="0"/>
+          <w:color w:val="19263C"/>
+          <w:sz w:val="21"/>
+        </w:rPr>
+        <w:t>Las decisiones sensibles registran actor, fecha, entidad y cambio.</w:t>
+      </w:r>
+    </w:p>
+    <w:p>
+      <w:pPr>
+        <w:pStyle w:val="Prrafodelista"/>
+        <w:numPr>
+          <w:ilvl w:val="0"/>
+          <w:numId w:val="3"/>
+        </w:numPr>
+        <w:spacing w:after="60"/>
+      </w:pPr>
+      <w:r>
+        <w:rPr>
+          <w:rFonts w:ascii="Arial" w:hAnsi="Arial"/>
+          <w:b w:val="0"/>
+          <w:i w:val="0"/>
+          <w:color w:val="19263C"/>
+          <w:sz w:val="21"/>
+        </w:rPr>
+        <w:t>Las historias no se cierran por tareas parciales ni por artefactos sin aceptación.</w:t>
+      </w:r>
+    </w:p>
+    <w:p>
+      <w:pPr>
+        <w:spacing w:before="160" w:after="120"/>
+      </w:pPr>
+      <w:r>
+        <w:rPr>
+          <w:rFonts w:ascii="Arial" w:hAnsi="Arial"/>
+          <w:b/>
+          <w:i w:val="0"/>
+          <w:color w:val="4472C4"/>
+          <w:sz w:val="25"/>
+        </w:rPr>
+        <w:t>Evidencia versionada</w:t>
+      </w:r>
+    </w:p>
+    <w:p>
+      <w:pPr>
+        <w:pStyle w:val="Prrafodelista"/>
+        <w:numPr>
+          <w:ilvl w:val="0"/>
+          <w:numId w:val="3"/>
+        </w:numPr>
+        <w:spacing w:after="60"/>
+      </w:pPr>
+      <w:r>
+        <w:rPr>
+          <w:rFonts w:ascii="Arial" w:hAnsi="Arial"/>
+          <w:b w:val="0"/>
+          <w:i w:val="0"/>
+          <w:color w:val="19263C"/>
+          <w:sz w:val="21"/>
+        </w:rPr>
+        <w:t>docs/design/01-arquitectura-contenedores.md</w:t>
+      </w:r>
+    </w:p>
+    <w:p>
+      <w:pPr>
+        <w:pStyle w:val="Prrafodelista"/>
+        <w:numPr>
+          <w:ilvl w:val="0"/>
+          <w:numId w:val="3"/>
+        </w:numPr>
+        <w:spacing w:after="60"/>
+      </w:pPr>
+      <w:r>
+        <w:rPr>
+          <w:rFonts w:ascii="Arial" w:hAnsi="Arial"/>
+          <w:b w:val="0"/>
+          <w:i w:val="0"/>
+          <w:color w:val="19263C"/>
+          <w:sz w:val="21"/>
+        </w:rPr>
+        <w:t>docs/design/02-modelo-er-diccionario.md</w:t>
+      </w:r>
+    </w:p>
+    <w:p>
+      <w:pPr>
+        <w:pStyle w:val="Prrafodelista"/>
+        <w:numPr>
+          <w:ilvl w:val="0"/>
+          <w:numId w:val="3"/>
+        </w:numPr>
+        <w:spacing w:after="60"/>
+      </w:pPr>
+      <w:r>
+        <w:rPr>
+          <w:rFonts w:ascii="Arial" w:hAnsi="Arial"/>
+          <w:b w:val="0"/>
+          <w:i w:val="0"/>
+          <w:color w:val="19263C"/>
+          <w:sz w:val="21"/>
+        </w:rPr>
+        <w:t>docs/design/03-uml-casos-de-uso.md</w:t>
+      </w:r>
+    </w:p>
+    <w:p>
+      <w:pPr>
+        <w:pStyle w:val="Prrafodelista"/>
+        <w:numPr>
+          <w:ilvl w:val="0"/>
+          <w:numId w:val="3"/>
+        </w:numPr>
+        <w:spacing w:after="60"/>
+      </w:pPr>
+      <w:r>
+        <w:rPr>
+          <w:rFonts w:ascii="Arial" w:hAnsi="Arial"/>
+          <w:b w:val="0"/>
+          <w:i w:val="0"/>
+          <w:color w:val="19263C"/>
+          <w:sz w:val="21"/>
+        </w:rPr>
+        <w:t>docs/design/04-prototipo-navegable.md</w:t>
+      </w:r>
+    </w:p>
+    <w:p>
+      <w:pPr>
+        <w:pStyle w:val="Prrafodelista"/>
+        <w:numPr>
+          <w:ilvl w:val="0"/>
+          <w:numId w:val="3"/>
+        </w:numPr>
+        <w:spacing w:after="60"/>
+      </w:pPr>
+      <w:r>
+        <w:rPr>
+          <w:rFonts w:ascii="Arial" w:hAnsi="Arial"/>
+          <w:b w:val="0"/>
+          <w:i w:val="0"/>
+          <w:color w:val="19263C"/>
+          <w:sz w:val="21"/>
+        </w:rPr>
+        <w:t>docs/scrum/sprint-1 y aplicaciones web/API del repositorio SIGAA.</w:t>
+      </w:r>
+    </w:p>
+    <w:p>
+      <w:r>
+        <w:br w:type="page"/>
+      </w:r>
+    </w:p>
+    <w:p>
+      <w:pPr>
+        <w:spacing w:before="240" w:after="120"/>
+      </w:pPr>
+      <w:r>
+        <w:rPr>
+          <w:rFonts w:ascii="Arial" w:hAnsi="Arial"/>
+          <w:b/>
+          <w:i w:val="0"/>
+          <w:color w:val="243F6B"/>
+          <w:sz w:val="34"/>
+        </w:rPr>
+        <w:t>ANEXO D. VALIDACIONES Y APORTES PENDIENTES</w:t>
+      </w:r>
+    </w:p>
+    <w:p>
+      <w:pPr>
+        <w:spacing w:after="120" w:line="259" w:lineRule="auto"/>
+      </w:pPr>
+      <w:r>
+        <w:rPr>
+          <w:rFonts w:ascii="Arial" w:hAnsi="Arial"/>
+          <w:b w:val="0"/>
+          <w:i w:val="0"/>
+          <w:color w:val="19263C"/>
+          <w:sz w:val="21"/>
+        </w:rPr>
+        <w:t>Los siguientes elementos no se completan automáticamente porque requieren información o decisiones de personas reales:</w:t>
+      </w:r>
+    </w:p>
+    <w:tbl>
+      <w:tblPr>
+        <w:tblW w:type="auto" w:w="0"/>
+        <w:jc w:val="center"/>
+        <w:tblLayout w:type="fixed"/>
+        <w:tblLook w:firstColumn="1" w:firstRow="1" w:lastColumn="0" w:lastRow="0" w:noHBand="0" w:noVBand="1" w:val="04A0"/>
+      </w:tblPr>
+      <w:tblGrid>
+        <w:gridCol w:w="2835"/>
+        <w:gridCol w:w="2835"/>
+        <w:gridCol w:w="2835"/>
+      </w:tblGrid>
+      <w:tr>
+        <w:tc>
+          <w:tcPr>
+            <w:tcW w:type="dxa" w:w="3456"/>
+            <w:vAlign w:val="center"/>
+            <w:tcMar>
+              <w:top w:w="100" w:type="dxa"/>
+              <w:start w:w="120" w:type="dxa"/>
+              <w:bottom w:w="100" w:type="dxa"/>
+              <w:end w:w="120" w:type="dxa"/>
+            </w:tcMar>
+            <w:shd w:fill="243F6B"/>
+          </w:tcPr>
+          <w:p>
+            <w:pPr>
+              <w:spacing w:after="0"/>
+            </w:pPr>
+            <w:r>
+              <w:rPr>
+                <w:rFonts w:ascii="Arial" w:hAnsi="Arial"/>
+                <w:b/>
+                <w:i w:val="0"/>
+                <w:color w:val="FFFFFF"/>
+                <w:sz w:val="18"/>
+              </w:rPr>
+              <w:t>Pendiente</w:t>
+            </w:r>
+          </w:p>
+        </w:tc>
+        <w:tc>
+          <w:tcPr>
+            <w:tcW w:type="dxa" w:w="2664"/>
+            <w:vAlign w:val="center"/>
+            <w:tcMar>
+              <w:top w:w="100" w:type="dxa"/>
+              <w:start w:w="120" w:type="dxa"/>
+              <w:bottom w:w="100" w:type="dxa"/>
+              <w:end w:w="120" w:type="dxa"/>
+            </w:tcMar>
+            <w:shd w:fill="243F6B"/>
+          </w:tcPr>
+          <w:p>
+            <w:pPr>
+              <w:spacing w:after="0"/>
+            </w:pPr>
+            <w:r>
+              <w:rPr>
+                <w:rFonts w:ascii="Arial" w:hAnsi="Arial"/>
+                <w:b/>
+                <w:i w:val="0"/>
+                <w:color w:val="FFFFFF"/>
+                <w:sz w:val="18"/>
+              </w:rPr>
+              <w:t>Responsable</w:t>
+            </w:r>
+          </w:p>
+        </w:tc>
+        <w:tc>
+          <w:tcPr>
+            <w:tcW w:type="dxa" w:w="4320"/>
+            <w:vAlign w:val="center"/>
+            <w:tcMar>
+              <w:top w:w="100" w:type="dxa"/>
+              <w:start w:w="120" w:type="dxa"/>
+              <w:bottom w:w="100" w:type="dxa"/>
+              <w:end w:w="120" w:type="dxa"/>
+            </w:tcMar>
+            <w:shd w:fill="243F6B"/>
+          </w:tcPr>
+          <w:p>
+            <w:pPr>
+              <w:spacing w:after="0"/>
+            </w:pPr>
+            <w:r>
+              <w:rPr>
+                <w:rFonts w:ascii="Arial" w:hAnsi="Arial"/>
+                <w:b/>
+                <w:i w:val="0"/>
+                <w:color w:val="FFFFFF"/>
+                <w:sz w:val="18"/>
+              </w:rPr>
+              <w:t>Evidencia de cierre</w:t>
+            </w:r>
+          </w:p>
+        </w:tc>
+      </w:tr>
+      <w:tr>
+        <w:tc>
+          <w:tcPr>
+            <w:tcW w:type="dxa" w:w="3456"/>
+            <w:vAlign w:val="center"/>
+            <w:tcMar>
+              <w:top w:w="100" w:type="dxa"/>
+              <w:start w:w="120" w:type="dxa"/>
+              <w:bottom w:w="100" w:type="dxa"/>
+              <w:end w:w="120" w:type="dxa"/>
+            </w:tcMar>
+          </w:tcPr>
+          <w:p>
+            <w:pPr>
+              <w:spacing w:after="0"/>
+            </w:pPr>
+            <w:r>
+              <w:rPr>
+                <w:rFonts w:ascii="Arial" w:hAnsi="Arial"/>
+                <w:b w:val="0"/>
+                <w:i w:val="0"/>
+                <w:color w:val="19263C"/>
+                <w:sz w:val="18"/>
+              </w:rPr>
+              <w:t>Validar problema, usuarios y reglas</w:t>
+            </w:r>
+          </w:p>
+        </w:tc>
+        <w:tc>
+          <w:tcPr>
+            <w:tcW w:type="dxa" w:w="2664"/>
+            <w:vAlign w:val="center"/>
+            <w:tcMar>
+              <w:top w:w="100" w:type="dxa"/>
+              <w:start w:w="120" w:type="dxa"/>
+              <w:bottom w:w="100" w:type="dxa"/>
+              <w:end w:w="120" w:type="dxa"/>
+            </w:tcMar>
+          </w:tcPr>
+          <w:p>
+            <w:pPr>
+              <w:spacing w:after="0"/>
+            </w:pPr>
+            <w:r>
+              <w:rPr>
+                <w:rFonts w:ascii="Arial" w:hAnsi="Arial"/>
+                <w:b w:val="0"/>
+                <w:i w:val="0"/>
+                <w:color w:val="19263C"/>
+                <w:sz w:val="18"/>
+              </w:rPr>
+              <w:t>Product Owner / contraparte</w:t>
+            </w:r>
+          </w:p>
+        </w:tc>
+        <w:tc>
+          <w:tcPr>
+            <w:tcW w:type="dxa" w:w="4320"/>
+            <w:vAlign w:val="center"/>
+            <w:tcMar>
+              <w:top w:w="100" w:type="dxa"/>
+              <w:start w:w="120" w:type="dxa"/>
+              <w:bottom w:w="100" w:type="dxa"/>
+              <w:end w:w="120" w:type="dxa"/>
+            </w:tcMar>
+          </w:tcPr>
+          <w:p>
+            <w:pPr>
+              <w:spacing w:after="0"/>
+            </w:pPr>
+            <w:r>
+              <w:rPr>
+                <w:rFonts w:ascii="Arial" w:hAnsi="Arial"/>
+                <w:b w:val="0"/>
+                <w:i w:val="0"/>
+                <w:color w:val="19263C"/>
+                <w:sz w:val="18"/>
+              </w:rPr>
+              <w:t>Minuta o correo confirmado</w:t>
+            </w:r>
+          </w:p>
+        </w:tc>
+      </w:tr>
+      <w:tr>
+        <w:tc>
+          <w:tcPr>
+            <w:tcW w:type="dxa" w:w="3456"/>
+            <w:vAlign w:val="center"/>
+            <w:tcMar>
+              <w:top w:w="100" w:type="dxa"/>
+              <w:start w:w="120" w:type="dxa"/>
+              <w:bottom w:w="100" w:type="dxa"/>
+              <w:end w:w="120" w:type="dxa"/>
+            </w:tcMar>
+            <w:shd w:fill="F2F4F7"/>
+          </w:tcPr>
+          <w:p>
+            <w:pPr>
+              <w:spacing w:after="0"/>
+            </w:pPr>
+            <w:r>
+              <w:rPr>
+                <w:rFonts w:ascii="Arial" w:hAnsi="Arial"/>
+                <w:b w:val="0"/>
+                <w:i w:val="0"/>
+                <w:color w:val="19263C"/>
+                <w:sz w:val="18"/>
+              </w:rPr>
+              <w:t>Completar RUT, docente y sección</w:t>
+            </w:r>
+          </w:p>
+        </w:tc>
+        <w:tc>
+          <w:tcPr>
+            <w:tcW w:type="dxa" w:w="2664"/>
+            <w:vAlign w:val="center"/>
+            <w:tcMar>
+              <w:top w:w="100" w:type="dxa"/>
+              <w:start w:w="120" w:type="dxa"/>
+              <w:bottom w:w="100" w:type="dxa"/>
+              <w:end w:w="120" w:type="dxa"/>
+            </w:tcMar>
+            <w:shd w:fill="F2F4F7"/>
+          </w:tcPr>
+          <w:p>
+            <w:pPr>
+              <w:spacing w:after="0"/>
+            </w:pPr>
+            <w:r>
+              <w:rPr>
+                <w:rFonts w:ascii="Arial" w:hAnsi="Arial"/>
+                <w:b w:val="0"/>
+                <w:i w:val="0"/>
+                <w:color w:val="19263C"/>
+                <w:sz w:val="18"/>
+              </w:rPr>
+              <w:t>Cada integrante</w:t>
+            </w:r>
+          </w:p>
+        </w:tc>
+        <w:tc>
+          <w:tcPr>
+            <w:tcW w:type="dxa" w:w="4320"/>
+            <w:vAlign w:val="center"/>
+            <w:tcMar>
+              <w:top w:w="100" w:type="dxa"/>
+              <w:start w:w="120" w:type="dxa"/>
+              <w:bottom w:w="100" w:type="dxa"/>
+              <w:end w:w="120" w:type="dxa"/>
+            </w:tcMar>
+            <w:shd w:fill="F2F4F7"/>
+          </w:tcPr>
+          <w:p>
+            <w:pPr>
+              <w:spacing w:after="0"/>
+            </w:pPr>
+            <w:r>
+              <w:rPr>
+                <w:rFonts w:ascii="Arial" w:hAnsi="Arial"/>
+                <w:b w:val="0"/>
+                <w:i w:val="0"/>
+                <w:color w:val="19263C"/>
+                <w:sz w:val="18"/>
+              </w:rPr>
+              <w:t>Plantillas sin campos pendientes</w:t>
+            </w:r>
+          </w:p>
+        </w:tc>
+      </w:tr>
+      <w:tr>
+        <w:tc>
+          <w:tcPr>
+            <w:tcW w:type="dxa" w:w="3456"/>
+            <w:vAlign w:val="center"/>
+            <w:tcMar>
+              <w:top w:w="100" w:type="dxa"/>
+              <w:start w:w="120" w:type="dxa"/>
+              <w:bottom w:w="100" w:type="dxa"/>
+              <w:end w:w="120" w:type="dxa"/>
+            </w:tcMar>
+          </w:tcPr>
+          <w:p>
+            <w:pPr>
+              <w:spacing w:after="0"/>
+            </w:pPr>
+            <w:r>
+              <w:rPr>
+                <w:rFonts w:ascii="Arial" w:hAnsi="Arial"/>
+                <w:b w:val="0"/>
+                <w:i w:val="0"/>
+                <w:color w:val="19263C"/>
+                <w:sz w:val="18"/>
+              </w:rPr>
+              <w:t>Ratificar roles operativos</w:t>
+            </w:r>
+          </w:p>
+        </w:tc>
+        <w:tc>
+          <w:tcPr>
+            <w:tcW w:type="dxa" w:w="2664"/>
+            <w:vAlign w:val="center"/>
+            <w:tcMar>
+              <w:top w:w="100" w:type="dxa"/>
+              <w:start w:w="120" w:type="dxa"/>
+              <w:bottom w:w="100" w:type="dxa"/>
+              <w:end w:w="120" w:type="dxa"/>
+            </w:tcMar>
+          </w:tcPr>
+          <w:p>
+            <w:pPr>
+              <w:spacing w:after="0"/>
+            </w:pPr>
+            <w:r>
+              <w:rPr>
+                <w:rFonts w:ascii="Arial" w:hAnsi="Arial"/>
+                <w:b w:val="0"/>
+                <w:i w:val="0"/>
+                <w:color w:val="19263C"/>
+                <w:sz w:val="18"/>
+              </w:rPr>
+              <w:t>Equipo</w:t>
+            </w:r>
+          </w:p>
+        </w:tc>
+        <w:tc>
+          <w:tcPr>
+            <w:tcW w:type="dxa" w:w="4320"/>
+            <w:vAlign w:val="center"/>
+            <w:tcMar>
+              <w:top w:w="100" w:type="dxa"/>
+              <w:start w:w="120" w:type="dxa"/>
+              <w:bottom w:w="100" w:type="dxa"/>
+              <w:end w:w="120" w:type="dxa"/>
+            </w:tcMar>
+          </w:tcPr>
+          <w:p>
+            <w:pPr>
+              <w:spacing w:after="0"/>
+            </w:pPr>
+            <w:r>
+              <w:rPr>
+                <w:rFonts w:ascii="Arial" w:hAnsi="Arial"/>
+                <w:b w:val="0"/>
+                <w:i w:val="0"/>
+                <w:color w:val="19263C"/>
+                <w:sz w:val="18"/>
+              </w:rPr>
+              <w:t>Acta o acuerdo registrado</w:t>
+            </w:r>
+          </w:p>
+        </w:tc>
+      </w:tr>
+      <w:tr>
+        <w:tc>
+          <w:tcPr>
+            <w:tcW w:type="dxa" w:w="3456"/>
+            <w:vAlign w:val="center"/>
+            <w:tcMar>
+              <w:top w:w="100" w:type="dxa"/>
+              <w:start w:w="120" w:type="dxa"/>
+              <w:bottom w:w="100" w:type="dxa"/>
+              <w:end w:w="120" w:type="dxa"/>
+            </w:tcMar>
+            <w:shd w:fill="F2F4F7"/>
+          </w:tcPr>
+          <w:p>
+            <w:pPr>
+              <w:spacing w:after="0"/>
+            </w:pPr>
+            <w:r>
+              <w:rPr>
+                <w:rFonts w:ascii="Arial" w:hAnsi="Arial"/>
+                <w:b w:val="0"/>
+                <w:i w:val="0"/>
+                <w:color w:val="19263C"/>
+                <w:sz w:val="18"/>
+              </w:rPr>
+              <w:t>Aplicar feedback formativo</w:t>
+            </w:r>
+          </w:p>
+        </w:tc>
+        <w:tc>
+          <w:tcPr>
+            <w:tcW w:type="dxa" w:w="2664"/>
+            <w:vAlign w:val="center"/>
+            <w:tcMar>
+              <w:top w:w="100" w:type="dxa"/>
+              <w:start w:w="120" w:type="dxa"/>
+              <w:bottom w:w="100" w:type="dxa"/>
+              <w:end w:w="120" w:type="dxa"/>
+            </w:tcMar>
+            <w:shd w:fill="F2F4F7"/>
+          </w:tcPr>
+          <w:p>
+            <w:pPr>
+              <w:spacing w:after="0"/>
+            </w:pPr>
+            <w:r>
+              <w:rPr>
+                <w:rFonts w:ascii="Arial" w:hAnsi="Arial"/>
+                <w:b w:val="0"/>
+                <w:i w:val="0"/>
+                <w:color w:val="19263C"/>
+                <w:sz w:val="18"/>
+              </w:rPr>
+              <w:t>Equipo</w:t>
+            </w:r>
+          </w:p>
+        </w:tc>
+        <w:tc>
+          <w:tcPr>
+            <w:tcW w:type="dxa" w:w="4320"/>
+            <w:vAlign w:val="center"/>
+            <w:tcMar>
+              <w:top w:w="100" w:type="dxa"/>
+              <w:start w:w="120" w:type="dxa"/>
+              <w:bottom w:w="100" w:type="dxa"/>
+              <w:end w:w="120" w:type="dxa"/>
+            </w:tcMar>
+            <w:shd w:fill="F2F4F7"/>
+          </w:tcPr>
+          <w:p>
+            <w:pPr>
+              <w:spacing w:after="0"/>
+            </w:pPr>
+            <w:r>
+              <w:rPr>
+                <w:rFonts w:ascii="Arial" w:hAnsi="Arial"/>
+                <w:b w:val="0"/>
+                <w:i w:val="0"/>
+                <w:color w:val="19263C"/>
+                <w:sz w:val="18"/>
+              </w:rPr>
+              <w:t>Matriz de observaciones y cambios</w:t>
+            </w:r>
+          </w:p>
+        </w:tc>
+      </w:tr>
+      <w:tr>
+        <w:tc>
+          <w:tcPr>
+            <w:tcW w:type="dxa" w:w="3456"/>
+            <w:vAlign w:val="center"/>
+            <w:tcMar>
+              <w:top w:w="100" w:type="dxa"/>
+              <w:start w:w="120" w:type="dxa"/>
+              <w:bottom w:w="100" w:type="dxa"/>
+              <w:end w:w="120" w:type="dxa"/>
+            </w:tcMar>
+          </w:tcPr>
+          <w:p>
+            <w:pPr>
+              <w:spacing w:after="0"/>
+            </w:pPr>
+            <w:r>
+              <w:rPr>
+                <w:rFonts w:ascii="Arial" w:hAnsi="Arial"/>
+                <w:b w:val="0"/>
+                <w:i w:val="0"/>
+                <w:color w:val="19263C"/>
+                <w:sz w:val="18"/>
+              </w:rPr>
+              <w:t>Ensayar presentación</w:t>
+            </w:r>
+          </w:p>
+        </w:tc>
+        <w:tc>
+          <w:tcPr>
+            <w:tcW w:type="dxa" w:w="2664"/>
+            <w:vAlign w:val="center"/>
+            <w:tcMar>
+              <w:top w:w="100" w:type="dxa"/>
+              <w:start w:w="120" w:type="dxa"/>
+              <w:bottom w:w="100" w:type="dxa"/>
+              <w:end w:w="120" w:type="dxa"/>
+            </w:tcMar>
+          </w:tcPr>
+          <w:p>
+            <w:pPr>
+              <w:spacing w:after="0"/>
+            </w:pPr>
+            <w:r>
+              <w:rPr>
+                <w:rFonts w:ascii="Arial" w:hAnsi="Arial"/>
+                <w:b w:val="0"/>
+                <w:i w:val="0"/>
+                <w:color w:val="19263C"/>
+                <w:sz w:val="18"/>
+              </w:rPr>
+              <w:t>Equipo</w:t>
+            </w:r>
+          </w:p>
+        </w:tc>
+        <w:tc>
+          <w:tcPr>
+            <w:tcW w:type="dxa" w:w="4320"/>
+            <w:vAlign w:val="center"/>
+            <w:tcMar>
+              <w:top w:w="100" w:type="dxa"/>
+              <w:start w:w="120" w:type="dxa"/>
+              <w:bottom w:w="100" w:type="dxa"/>
+              <w:end w:w="120" w:type="dxa"/>
+            </w:tcMar>
+          </w:tcPr>
+          <w:p>
+            <w:pPr>
+              <w:spacing w:after="0"/>
+            </w:pPr>
+            <w:r>
+              <w:rPr>
+                <w:rFonts w:ascii="Arial" w:hAnsi="Arial"/>
+                <w:b w:val="0"/>
+                <w:i w:val="0"/>
+                <w:color w:val="19263C"/>
+                <w:sz w:val="18"/>
+              </w:rPr>
+              <w:t>Registro de ensayo y preguntas</w:t>
+            </w:r>
+          </w:p>
+        </w:tc>
+      </w:tr>
+      <w:tr>
+        <w:tc>
+          <w:tcPr>
+            <w:tcW w:type="dxa" w:w="3456"/>
+            <w:vAlign w:val="center"/>
+            <w:tcMar>
+              <w:top w:w="100" w:type="dxa"/>
+              <w:start w:w="120" w:type="dxa"/>
+              <w:bottom w:w="100" w:type="dxa"/>
+              <w:end w:w="120" w:type="dxa"/>
+            </w:tcMar>
+            <w:shd w:fill="F2F4F7"/>
+          </w:tcPr>
+          <w:p>
+            <w:pPr>
+              <w:spacing w:after="0"/>
+            </w:pPr>
+            <w:r>
+              <w:rPr>
+                <w:rFonts w:ascii="Arial" w:hAnsi="Arial"/>
+                <w:b w:val="0"/>
+                <w:i w:val="0"/>
+                <w:color w:val="19263C"/>
+                <w:sz w:val="18"/>
+              </w:rPr>
+              <w:t>Reflexiones y conclusiones individuales</w:t>
+            </w:r>
+          </w:p>
+        </w:tc>
+        <w:tc>
+          <w:tcPr>
+            <w:tcW w:type="dxa" w:w="2664"/>
+            <w:vAlign w:val="center"/>
+            <w:tcMar>
+              <w:top w:w="100" w:type="dxa"/>
+              <w:start w:w="120" w:type="dxa"/>
+              <w:bottom w:w="100" w:type="dxa"/>
+              <w:end w:w="120" w:type="dxa"/>
+            </w:tcMar>
+            <w:shd w:fill="F2F4F7"/>
+          </w:tcPr>
+          <w:p>
+            <w:pPr>
+              <w:spacing w:after="0"/>
+            </w:pPr>
+            <w:r>
+              <w:rPr>
+                <w:rFonts w:ascii="Arial" w:hAnsi="Arial"/>
+                <w:b w:val="0"/>
+                <w:i w:val="0"/>
+                <w:color w:val="19263C"/>
+                <w:sz w:val="18"/>
+              </w:rPr>
+              <w:t>Cada estudiante</w:t>
+            </w:r>
+          </w:p>
+        </w:tc>
+        <w:tc>
+          <w:tcPr>
+            <w:tcW w:type="dxa" w:w="4320"/>
+            <w:vAlign w:val="center"/>
+            <w:tcMar>
+              <w:top w:w="100" w:type="dxa"/>
+              <w:start w:w="120" w:type="dxa"/>
+              <w:bottom w:w="100" w:type="dxa"/>
+              <w:end w:w="120" w:type="dxa"/>
+            </w:tcMar>
+            <w:shd w:fill="F2F4F7"/>
+          </w:tcPr>
+          <w:p>
+            <w:pPr>
+              <w:spacing w:after="0"/>
+            </w:pPr>
+            <w:r>
+              <w:rPr>
+                <w:rFonts w:ascii="Arial" w:hAnsi="Arial"/>
+                <w:b w:val="0"/>
+                <w:i w:val="0"/>
+                <w:color w:val="19263C"/>
+                <w:sz w:val="18"/>
+              </w:rPr>
+              <w:t>Texto personal en español/inglés</w:t>
+            </w:r>
+          </w:p>
+        </w:tc>
+      </w:tr>
+    </w:tbl>
+    <w:p>
+      <w:pPr>
+        <w:spacing w:before="280" w:after="120"/>
+      </w:pPr>
+      <w:r>
+        <w:rPr>
+          <w:rFonts w:ascii="Arial" w:hAnsi="Arial"/>
+          <w:b/>
+          <w:i w:val="0"/>
+          <w:color w:val="243F6B"/>
+          <w:sz w:val="21"/>
+        </w:rPr>
+        <w:t xml:space="preserve">Nota de integridad académica: </w:t>
+      </w:r>
+      <w:r>
+        <w:rPr>
+          <w:rFonts w:ascii="Arial" w:hAnsi="Arial"/>
+          <w:b w:val="0"/>
+          <w:i w:val="0"/>
+          <w:color w:val="19263C"/>
+          <w:sz w:val="21"/>
+        </w:rPr>
+        <w:t>la simulación temporal permite producir artefactos y pruebas, pero no autoriza inventar entrevistas, opiniones, asistencia o reflexiones de terceros.</w:t>
+      </w:r>
+    </w:p>
     <w:sectPr>
       <w:headerReference w:type="default" r:id="rId10"/>
       <w:pgSz w:w="11906" w:h="16838"/>

</xml_diff>